<commit_message>
Make wizard localization review single pass
</commit_message>
<xml_diff>
--- a/docs/guides/Delphi App Translation Studio Wizard-to-Runtime Complete Procedure.docx
+++ b/docs/guides/Delphi App Translation Studio Wizard-to-Runtime Complete Procedure.docx
@@ -132,7 +132,7 @@
           <w:color w:val="5D7693"/>
           <w:sz w:val="20"/>
         </w:rPr>
-        <w:t>Every required transition is included: clean test copy, Wizard, localization review, second-pass update, Studio verification, RAD Studio component placement, builds, deployment, and runtime testing.</w:t>
+        <w:t>Every required transition is included: clean test copy, Wizard, in-Wizard localization review, automatic finalization, optional Studio verification, RAD Studio component placement, builds, deployment, and runtime testing.</w:t>
       </w:r>
     </w:p>
     <w:p>
@@ -264,7 +264,7 @@
           <w:color w:val="163A63"/>
           <w:sz w:val="18"/>
         </w:rPr>
-        <w:t>5. Wizard Pass One - Create the Translation</w:t>
+        <w:t>5. Single Wizard Pass - Create, Review, and Finalize</w:t>
       </w:r>
       <w:r>
         <w:rPr>
@@ -274,7 +274,7 @@
           <w:color w:val="5D7693"/>
           <w:sz w:val="18"/>
         </w:rPr>
-        <w:t xml:space="preserve"> .............................. 4</w:t>
+        <w:t xml:space="preserve"> ..................... 4</w:t>
       </w:r>
       <w:r>
         <w:br/>
@@ -287,7 +287,7 @@
           <w:color w:val="163A63"/>
           <w:sz w:val="18"/>
         </w:rPr>
-        <w:t>6. Review the First-Pass Translation</w:t>
+        <w:t>6. Complete the In-Wizard Localization Review</w:t>
       </w:r>
       <w:r>
         <w:rPr>
@@ -297,7 +297,7 @@
           <w:color w:val="5D7693"/>
           <w:sz w:val="18"/>
         </w:rPr>
-        <w:t xml:space="preserve"> ..................................... 7</w:t>
+        <w:t xml:space="preserve"> ............................ 7</w:t>
       </w:r>
       <w:r>
         <w:br/>
@@ -310,7 +310,7 @@
           <w:color w:val="163A63"/>
           <w:sz w:val="18"/>
         </w:rPr>
-        <w:t>7. Wizard Pass Two - Apply Saved Review Decisions</w:t>
+        <w:t>7. Automatic Resume - Finalize Reviewed Output</w:t>
       </w:r>
       <w:r>
         <w:rPr>
@@ -320,7 +320,7 @@
           <w:color w:val="5D7693"/>
           <w:sz w:val="18"/>
         </w:rPr>
-        <w:t xml:space="preserve"> ........................ 8</w:t>
+        <w:t xml:space="preserve"> ........................... 8</w:t>
       </w:r>
       <w:r>
         <w:br/>
@@ -653,12 +653,12 @@
     </w:p>
     <w:p>
       <w:r>
-        <w:t>The current workflow requires two Wizard passes when layout or project-glossary decisions are made after the first translation. The first pass creates the translated catalog and its review proposals. The developer reviews those proposals. The second pass, Update Existing Translation, applies the saved glossary, embeds accepted layout rules in the runtime JSON, and refreshes the generated component kit.</w:t>
-      </w:r>
-    </w:p>
-    <w:p>
-      <w:r>
-        <w:t>After the two Wizard passes, the main Studio may be used to inspect the exact development catalog, make any necessary text correction, perform final validation, export the final runtime pack, and refresh the component kit. RAD Studio is then used to install the design package, place the manager and selector, build the target, and test runtime behavior.</w:t>
+        <w:t>The current workflow uses one protected Wizard processing pass. It creates the translated development catalog, automatically opens Localization Review, waits while the developer records terminology and layout decisions, and resumes automatically when the Review Center closes. The resumed pass applies those decisions before final validation, runtime JSON export, component-kit generation, Search Path configuration, and deployment configuration.</w:t>
+      </w:r>
+    </w:p>
+    <w:p>
+      <w:r>
+        <w:t>After the single Wizard pass, the main Studio may be used for optional detailed inspection or manual correction. RAD Studio is then used to install the design package, place the manager and selector, build the target, and test runtime behavior.</w:t>
       </w:r>
     </w:p>
     <w:tbl>
@@ -1008,7 +1008,7 @@
         <w:t xml:space="preserve">[  ] </w:t>
       </w:r>
       <w:r>
-        <w:t>The first pass produces a development catalog, runtime pack, review package, and component kit.</w:t>
+        <w:t>The protected Wizard pass pauses for Localization Review before its definitive export.</w:t>
       </w:r>
     </w:p>
     <w:p>
@@ -1022,7 +1022,7 @@
         <w:t xml:space="preserve">[  ] </w:t>
       </w:r>
       <w:r>
-        <w:t>The second pass preserves completed work and embeds accepted glossary/layout decisions.</w:t>
+        <w:t>Closing Localization Review resumes the same Wizard pass and embeds accepted glossary/layout decisions.</w:t>
       </w:r>
     </w:p>
     <w:p>
@@ -2168,7 +2168,7 @@
         <w:pStyle w:val="Heading1"/>
       </w:pPr>
       <w:r>
-        <w:t>5. Wizard Pass One - Create the Translation</w:t>
+        <w:t>5. Single Wizard Pass - Create, Review, and Finalize</w:t>
       </w:r>
     </w:p>
     <w:p>
@@ -3447,7 +3447,7 @@
         </w:numPr>
       </w:pPr>
       <w:r>
-        <w:t>The Localization Review button is available, but the richest terminology suggestions and layout proposals do not exist until translations have been created. For the ordinary first test, continue with Next.</w:t>
+        <w:t>The Localization Review button is available here, but the richest terminology suggestions and layout proposals do not exist until translations have been created. Continue with Next. The Wizard will open Localization Review automatically during final processing.</w:t>
       </w:r>
     </w:p>
     <w:p>
@@ -3643,7 +3643,7 @@
         </w:numPr>
       </w:pPr>
       <w:r>
-        <w:t>After processing begins, do not try to close the Wizard or Studio. Back, Cancel, and the step rail remain disabled until processing succeeds or stops safely.</w:t>
+        <w:t>After processing begins, do not try to close the Wizard or Studio. Back, Cancel, and the step rail remain disabled. The Wizard will translate, open Localization Review, and automatically resume finalization after Review closes.</w:t>
       </w:r>
     </w:p>
     <w:p>
@@ -3711,91 +3711,7 @@
         </w:numPr>
       </w:pPr>
       <w:r>
-        <w:t>Confirm the progress log lists the localization review, layout proposal, and multilingual layout envelope paths. In File Explorer, open C:\New Delphi Projects\Delphi App Translation\export\localization-review\&lt;ApplicationId&gt;\&lt;language&gt; and verify that localization-review.html, layout-proposal.json, and multilingual-layout-envelope.json exist and are not zero bytes.</w:t>
-      </w:r>
-    </w:p>
-    <w:p>
-      <w:pPr>
-        <w:pStyle w:val="ListNumber"/>
-        <w:numPr>
-          <w:ilvl w:val="0"/>
-          <w:numId w:val="21"/>
-        </w:numPr>
-      </w:pPr>
-      <w:r>
-        <w:t>Confirm validation passed. Warnings may remain; blocking errors must not remain.</w:t>
-      </w:r>
-    </w:p>
-    <w:p>
-      <w:pPr>
-        <w:pStyle w:val="ListNumber"/>
-        <w:numPr>
-          <w:ilvl w:val="0"/>
-          <w:numId w:val="21"/>
-        </w:numPr>
-      </w:pPr>
-      <w:r>
-        <w:t>Confirm Runtime JSON pack exported appears with a path under the disposable test project's Localization\Languages folder.</w:t>
-      </w:r>
-    </w:p>
-    <w:p>
-      <w:pPr>
-        <w:pStyle w:val="ListNumber"/>
-        <w:numPr>
-          <w:ilvl w:val="0"/>
-          <w:numId w:val="21"/>
-        </w:numPr>
-      </w:pPr>
-      <w:r>
-        <w:t>Confirm Component integration kit generated appears.</w:t>
-      </w:r>
-    </w:p>
-    <w:p>
-      <w:pPr>
-        <w:pStyle w:val="ListNumber"/>
-        <w:numPr>
-          <w:ilvl w:val="0"/>
-          <w:numId w:val="21"/>
-        </w:numPr>
-      </w:pPr>
-      <w:r>
-        <w:t>Confirm Project Search Path and automatic post-build deployment configured appears.</w:t>
-      </w:r>
-    </w:p>
-    <w:p>
-      <w:pPr>
-        <w:pStyle w:val="ListNumber"/>
-        <w:numPr>
-          <w:ilvl w:val="0"/>
-          <w:numId w:val="21"/>
-        </w:numPr>
-      </w:pPr>
-      <w:r>
-        <w:t>Confirm the footer says Setup Wizard completed successfully. If it says stopped, do not continue to RAD Studio. Copy or photograph the entire progress log and footer message, close the Wizard only after processing has stopped safely, preserve the Wizard ZIP backup and disposable test folder, and send the exact STOPPED text and screenshots to the development team. Resume only after the cause is corrected and new test instructions are provided.</w:t>
-      </w:r>
-    </w:p>
-    <w:p>
-      <w:pPr>
-        <w:pStyle w:val="ListNumber"/>
-        <w:numPr>
-          <w:ilvl w:val="0"/>
-          <w:numId w:val="21"/>
-        </w:numPr>
-      </w:pPr>
-      <w:r>
-        <w:t>Click the blue component-kit path or Open Kit Folder. Confirm ComponentSource, Localization, component-integration.json, Deploy-LanguagePacks.ps1, README.txt, and Wizard-Completion-Report.txt exist.</w:t>
-      </w:r>
-    </w:p>
-    <w:p>
-      <w:pPr>
-        <w:pStyle w:val="ListNumber"/>
-        <w:numPr>
-          <w:ilvl w:val="0"/>
-          <w:numId w:val="21"/>
-        </w:numPr>
-      </w:pPr>
-      <w:r>
-        <w:t>Leave the Wizard open for the next review step. Do not click Finish yet.</w:t>
+        <w:t>Confirm the progress log reports that the required in-Wizard localization review is opening. The Translation Studio and Wizard remain protected while the modal Review Center is active.</w:t>
       </w:r>
     </w:p>
     <w:p>
@@ -3803,7 +3719,7 @@
         <w:pStyle w:val="Heading1"/>
       </w:pPr>
       <w:r>
-        <w:t>6. Review the First-Pass Translation</w:t>
+        <w:t>6. Complete the In-Wizard Localization Review</w:t>
       </w:r>
     </w:p>
     <w:p>
@@ -3815,7 +3731,7 @@
         </w:numPr>
       </w:pPr>
       <w:r>
-        <w:t>On the Wizard completion page, click Review Localization.</w:t>
+        <w:t>Wait for the Localization Review Center to open automatically. Do not click Finish and do not start another Wizard.</w:t>
       </w:r>
     </w:p>
     <w:p>
@@ -3947,19 +3863,7 @@
         </w:numPr>
       </w:pPr>
       <w:r>
-        <w:t>Click Close to return to the Wizard.</w:t>
-      </w:r>
-    </w:p>
-    <w:p>
-      <w:pPr>
-        <w:pStyle w:val="ListNumber"/>
-        <w:numPr>
-          <w:ilvl w:val="0"/>
-          <w:numId w:val="22"/>
-        </w:numPr>
-      </w:pPr>
-      <w:r>
-        <w:t>Click Finish to close Wizard pass one and return to the Studio main form.</w:t>
+        <w:t>Click Close. This records the end of the review phase and returns control to the protected Wizard processing pass.</w:t>
       </w:r>
     </w:p>
     <w:tbl>
@@ -4045,7 +3949,7 @@
                 <w:color w:val="163A63"/>
                 <w:sz w:val="20"/>
               </w:rPr>
-              <w:t xml:space="preserve">Why pass two is required. </w:t>
+              <w:t xml:space="preserve">Do not start a second Wizard pass. </w:t>
             </w:r>
             <w:r>
               <w:rPr>
@@ -4055,7 +3959,7 @@
                 <w:color w:val="163A63"/>
                 <w:sz w:val="20"/>
               </w:rPr>
-              <w:t>The first runtime pack was exported before these review decisions were made. The next Wizard update applies the saved project glossary and embeds accepted safe layout rules into a newly exported runtime pack.</w:t>
+              <w:t>Closing Localization Review now resumes the original processing pass. The Wizard applies the saved glossary and accepted layout rules before it performs the definitive validation, runtime-pack export, and component-kit generation.</w:t>
             </w:r>
           </w:p>
         </w:tc>
@@ -4067,7 +3971,7 @@
         <w:pStyle w:val="Heading1"/>
       </w:pPr>
       <w:r>
-        <w:t>7. Wizard Pass Two - Apply Saved Review Decisions</w:t>
+        <w:t>7. Automatic Resume - Finalize Reviewed Output</w:t>
       </w:r>
     </w:p>
     <w:p>
@@ -4079,7 +3983,7 @@
         </w:numPr>
       </w:pPr>
       <w:r>
-        <w:t>Click Start Setup Wizard again.</w:t>
+        <w:t>After the Review Center closes, do not press anything while the progress log resumes automatically.</w:t>
       </w:r>
     </w:p>
     <w:p>
@@ -4091,7 +3995,7 @@
         </w:numPr>
       </w:pPr>
       <w:r>
-        <w:t>Click Next on Welcome.</w:t>
+        <w:t>Confirm the log reports Localization review closed and reviewed decisions being applied.</w:t>
       </w:r>
     </w:p>
     <w:p>
@@ -4103,7 +4007,7 @@
         </w:numPr>
       </w:pPr>
       <w:r>
-        <w:t>Browse to the same disposable test project's .dproj.</w:t>
+        <w:t>Confirm Reviewed development catalog saved appears.</w:t>
       </w:r>
     </w:p>
     <w:p>
@@ -4115,7 +4019,7 @@
         </w:numPr>
       </w:pPr>
       <w:r>
-        <w:t>Confirm the same Application ID and framework.</w:t>
+        <w:t>Confirm the progress log lists the final localization review, layout proposal, and multilingual layout envelope paths. In File Explorer, open C:\New Delphi Projects\Delphi App Translation\export\localization-review\&lt;ApplicationId&gt;\&lt;language&gt; and verify that localization-review.html, layout-proposal.json, and multilingual-layout-envelope.json exist and are not zero bytes.</w:t>
       </w:r>
     </w:p>
     <w:p>
@@ -4127,7 +4031,7 @@
         </w:numPr>
       </w:pPr>
       <w:r>
-        <w:t>On Languages, select the same source and target language used in pass one.</w:t>
+        <w:t>Confirm validation passed. Warnings may remain; blocking errors must not remain.</w:t>
       </w:r>
     </w:p>
     <w:p>
@@ -4139,7 +4043,7 @@
         </w:numPr>
       </w:pPr>
       <w:r>
-        <w:t>Leave Workflow on Automatic. Confirm Existing catalog detected and Update the existing translation is reported.</w:t>
+        <w:t>Confirm Runtime JSON pack exported appears with a path under the disposable test project's Localization\Languages folder.</w:t>
       </w:r>
     </w:p>
     <w:p>
@@ -4151,7 +4055,7 @@
         </w:numPr>
       </w:pPr>
       <w:r>
-        <w:t>Confirm the translation provider and stored key, then click Test Connection again.</w:t>
+        <w:t>Confirm Component integration kit generated appears.</w:t>
       </w:r>
     </w:p>
     <w:p>
@@ -4163,7 +4067,7 @@
         </w:numPr>
       </w:pPr>
       <w:r>
-        <w:t>Run Scan Project again. Confirm completed translations are preserved and only actual new or changed source entries are unresolved.</w:t>
+        <w:t>Confirm Project Search Path and automatic post-build deployment configured appears.</w:t>
       </w:r>
     </w:p>
     <w:p>
@@ -4175,7 +4079,7 @@
         </w:numPr>
       </w:pPr>
       <w:r>
-        <w:t>Read the component step, click Show Design BPL if desired, check the required understanding box, and click Next.</w:t>
+        <w:t>Confirm the footer says Setup Wizard completed successfully. If it says stopped, do not continue to RAD Studio. Copy or photograph the entire progress log and footer message, close the Wizard only after processing has stopped safely, preserve the Wizard ZIP backup and disposable test folder, and send the exact STOPPED text and screenshots to the development team. Resume only after the cause is corrected and new test instructions are provided.</w:t>
       </w:r>
     </w:p>
     <w:p>
@@ -4187,7 +4091,7 @@
         </w:numPr>
       </w:pPr>
       <w:r>
-        <w:t>Close the target project in RAD Studio if it was opened accidentally.</w:t>
+        <w:t>Click the blue component-kit path or Open Kit Folder. Confirm ComponentSource, Localization, component-integration.json, Deploy-LanguagePacks.ps1, README.txt, and Wizard-Completion-Report.txt exist.</w:t>
       </w:r>
     </w:p>
     <w:p>
@@ -4199,7 +4103,7 @@
         </w:numPr>
       </w:pPr>
       <w:r>
-        <w:t>Check the target-project-closed and authorization boxes, then click Begin Final Processing.</w:t>
+        <w:t>Confirm the completion report states that review was completed inside the same Wizard processing pass before final export.</w:t>
       </w:r>
     </w:p>
     <w:p>
@@ -4211,31 +4115,7 @@
         </w:numPr>
       </w:pPr>
       <w:r>
-        <w:t>Confirm the progress reports glossary translations applied when applicable, validation passed, runtime pack exported, component kit generated, deployment configured, and successful completion.</w:t>
-      </w:r>
-    </w:p>
-    <w:p>
-      <w:pPr>
-        <w:pStyle w:val="ListNumber"/>
-        <w:numPr>
-          <w:ilvl w:val="0"/>
-          <w:numId w:val="23"/>
-        </w:numPr>
-      </w:pPr>
-      <w:r>
-        <w:t>Click Review Localization only to confirm the saved glossary and layout decisions persisted. Do not create new decisions during this confirmation pass; a new decision would require another export/update.</w:t>
-      </w:r>
-    </w:p>
-    <w:p>
-      <w:pPr>
-        <w:pStyle w:val="ListNumber"/>
-        <w:numPr>
-          <w:ilvl w:val="0"/>
-          <w:numId w:val="23"/>
-        </w:numPr>
-      </w:pPr>
-      <w:r>
-        <w:t>Close Localization Review and click Finish.</w:t>
+        <w:t>Click Finish once. The Wizard closes and returns to the Studio main form.</w:t>
       </w:r>
     </w:p>
     <w:p>
@@ -4248,7 +4128,7 @@
     </w:p>
     <w:p>
       <w:r>
-        <w:t>The two Wizard passes have already translated, validated, exported, and refreshed the project. If pass two completed successfully, validation reported no errors, and no translation, glossary, locale, or layout correction is needed, Section 8 is optional. You may stop using the Translation Studio here and proceed directly to Section 9 for the required RAD Studio installation and component-placement work.</w:t>
+        <w:t>The single Wizard pass has already translated, reviewed, validated, exported, and refreshed the project. If it completed successfully, validation reported no errors, and no additional translation, glossary, locale, or layout correction is needed, Section 8 is optional. You may stop using the Translation Studio here and proceed directly to Section 9 for the required RAD Studio installation and component-placement work.</w:t>
       </w:r>
     </w:p>
     <w:p>
@@ -6341,7 +6221,7 @@
         </w:numPr>
       </w:pPr>
       <w:r>
-        <w:t>Complete Wizard pass one, review terminology and layout for that language, and complete Wizard pass two when decisions were saved.</w:t>
+        <w:t>Complete the single Wizard pass. Review terminology and layout when the Review Center opens automatically, then allow the Wizard to resume finalization.</w:t>
       </w:r>
     </w:p>
     <w:p>
@@ -6425,7 +6305,7 @@
         <w:t xml:space="preserve">[  ] </w:t>
       </w:r>
       <w:r>
-        <w:t>Wizard pass one completed successfully and translated unresolved entries.</w:t>
+        <w:t>The single Wizard pass translated unresolved entries and opened Localization Review before final export.</w:t>
       </w:r>
     </w:p>
     <w:p>
@@ -6453,7 +6333,7 @@
         <w:t xml:space="preserve">[  ] </w:t>
       </w:r>
       <w:r>
-        <w:t>Wizard pass two applied saved review decisions.</w:t>
+        <w:t>The same Wizard pass resumed automatically and applied saved review decisions.</w:t>
       </w:r>
     </w:p>
     <w:p>
@@ -6653,7 +6533,7 @@
         <w:pStyle w:val="ListBullet"/>
       </w:pPr>
       <w:r>
-        <w:t>Pass-one and pass-two scan totals and unresolved counts.</w:t>
+        <w:t>Single-pass scan total, unresolved count, and automatic-resume result.</w:t>
       </w:r>
     </w:p>
     <w:p>

</xml_diff>

<commit_message>
Clarify adding a new translation language
</commit_message>
<xml_diff>
--- a/docs/guides/Delphi App Translation Studio Wizard-to-Runtime Complete Procedure.docx
+++ b/docs/guides/Delphi App Translation Studio Wizard-to-Runtime Complete Procedure.docx
@@ -573,7 +573,7 @@
           <w:color w:val="5D7693"/>
           <w:sz w:val="18"/>
         </w:rPr>
-        <w:t xml:space="preserve"> ........................................... 16</w:t>
+        <w:t xml:space="preserve"> ........................................... 17</w:t>
       </w:r>
       <w:r>
         <w:br/>
@@ -596,7 +596,7 @@
           <w:color w:val="5D7693"/>
           <w:sz w:val="18"/>
         </w:rPr>
-        <w:t xml:space="preserve"> ...................................... 17</w:t>
+        <w:t xml:space="preserve"> ...................................... 18</w:t>
       </w:r>
       <w:r>
         <w:br/>
@@ -619,7 +619,7 @@
           <w:color w:val="5D7693"/>
           <w:sz w:val="18"/>
         </w:rPr>
-        <w:t xml:space="preserve"> ............................................ 17</w:t>
+        <w:t xml:space="preserve"> ............................................ 18</w:t>
       </w:r>
       <w:r>
         <w:fldChar w:fldCharType="end"/>
@@ -6165,6 +6165,11 @@
       </w:r>
     </w:p>
     <w:p>
+      <w:r>
+        <w:t>Use this procedure when the application already has working localization and you want to add one new target language. Do not recreate the project from its pristine copy, remove existing language packs, reinstall the design package, or place additional localization components. One Wizard run adds one target language while preserving the languages already present.</w:t>
+      </w:r>
+    </w:p>
+    <w:p>
       <w:pPr>
         <w:pStyle w:val="ListNumber"/>
         <w:numPr>
@@ -6173,7 +6178,7 @@
         </w:numPr>
       </w:pPr>
       <w:r>
-        <w:t>Keep the same disposable or approved working project and its existing manager/selector components.</w:t>
+        <w:t>Open the existing approved working project in the Translation Studio. Keep its current Localization folder, language packs, project glossary, language manager, and connected selector intact.</w:t>
       </w:r>
     </w:p>
     <w:p>
@@ -6185,7 +6190,7 @@
         </w:numPr>
       </w:pPr>
       <w:r>
-        <w:t>Start the Setup Wizard.</w:t>
+        <w:t>Start the Setup Wizard and select the same project file used for the existing translation. Confirm that the detected Application ID exactly matches the ApplicationId already assigned to the language manager.</w:t>
       </w:r>
     </w:p>
     <w:p>
@@ -6197,7 +6202,7 @@
         </w:numPr>
       </w:pPr>
       <w:r>
-        <w:t>Select the same project and source language but choose a different target language.</w:t>
+        <w:t>Choose the same source language used by the existing packs. In Target language, choose only the new language being added.</w:t>
       </w:r>
     </w:p>
     <w:p>
@@ -6209,7 +6214,7 @@
         </w:numPr>
       </w:pPr>
       <w:r>
-        <w:t>Use Automatic. It should create a new development catalog for that language while preserving catalogs for other languages.</w:t>
+        <w:t>Leave Workflow set to Automatic (Recommended). Because this target language does not yet have a development catalog, the Wizard should report that it will create a new translation. Existing catalogs and runtime packs for other languages remain unchanged.</w:t>
       </w:r>
     </w:p>
     <w:p>
@@ -6221,7 +6226,7 @@
         </w:numPr>
       </w:pPr>
       <w:r>
-        <w:t>Complete the single Wizard pass. Review terminology and layout when the Review Center opens automatically, then allow the Wizard to resume finalization.</w:t>
+        <w:t>Confirm the translation provider and test its connection. Scan the project and review the scan total before continuing.</w:t>
       </w:r>
     </w:p>
     <w:p>
@@ -6233,7 +6238,7 @@
         </w:numPr>
       </w:pPr>
       <w:r>
-        <w:t>Perform final Studio validation/export and regenerate the component kit.</w:t>
+        <w:t>Complete the component-information and authorization steps, then click Begin Final Processing.</w:t>
       </w:r>
     </w:p>
     <w:p>
@@ -6245,7 +6250,7 @@
         </w:numPr>
       </w:pPr>
       <w:r>
-        <w:t>Build or deploy the packs to every executable folder.</w:t>
+        <w:t>When Localization Review opens automatically, review terminology and layout proposals for the new language. Save the desired decisions and click Close.</w:t>
       </w:r>
     </w:p>
     <w:p>
@@ -6257,7 +6262,7 @@
         </w:numPr>
       </w:pPr>
       <w:r>
-        <w:t>Run the application. The existing connected selector should discover the new JSON pack automatically; do not add another manager or combo box.</w:t>
+        <w:t>Wait while the same Wizard pass resumes automatically. Confirm that final validation passes, the new runtime JSON pack is exported, the component kit is refreshed, deployment is configured, and the footer reports successful completion.</w:t>
       </w:r>
     </w:p>
     <w:p>
@@ -6269,7 +6274,55 @@
         </w:numPr>
       </w:pPr>
       <w:r>
-        <w:t>Test translation, layout, source restoration, and preference behavior separately for the new language.</w:t>
+        <w:t>Click Finish. A separate Studio validation/export or second Wizard pass is not required when this single-pass completion succeeds. Use the main Studio only if a manual correction or detailed inspection is needed.</w:t>
+      </w:r>
+    </w:p>
+    <w:p>
+      <w:pPr>
+        <w:pStyle w:val="ListNumber"/>
+        <w:numPr>
+          <w:ilvl w:val="0"/>
+          <w:numId w:val="36"/>
+        </w:numPr>
+      </w:pPr>
+      <w:r>
+        <w:t>Do not reinstall the design package and do not place another manager or selector. The components already in the target application serve every language pack that shares the same Application ID.</w:t>
+      </w:r>
+    </w:p>
+    <w:p>
+      <w:pPr>
+        <w:pStyle w:val="ListNumber"/>
+        <w:numPr>
+          <w:ilvl w:val="0"/>
+          <w:numId w:val="36"/>
+        </w:numPr>
+      </w:pPr>
+      <w:r>
+        <w:t>Build the required Win32 and Win64 configurations, or use the Wizard deployment control for a portable/external application folder. Confirm the new language JSON file appears beside every executable under Localization\Languages together with the existing packs.</w:t>
+      </w:r>
+    </w:p>
+    <w:p>
+      <w:pPr>
+        <w:pStyle w:val="ListNumber"/>
+        <w:numPr>
+          <w:ilvl w:val="0"/>
+          <w:numId w:val="36"/>
+        </w:numPr>
+      </w:pPr>
+      <w:r>
+        <w:t>Run the application. Open the existing language selector and confirm the new language appears alongside the source language and all earlier target languages.</w:t>
+      </w:r>
+    </w:p>
+    <w:p>
+      <w:pPr>
+        <w:pStyle w:val="ListNumber"/>
+        <w:numPr>
+          <w:ilvl w:val="0"/>
+          <w:numId w:val="36"/>
+        </w:numPr>
+      </w:pPr>
+      <w:r>
+        <w:t>Select the new language and test its translation, layout, secondary forms, source-language restoration, repeated switching, and saved preference independently. Then verify that previously installed languages still work.</w:t>
       </w:r>
     </w:p>
     <w:p>
@@ -6347,7 +6400,7 @@
         <w:t xml:space="preserve">[  ] </w:t>
       </w:r>
       <w:r>
-        <w:t>Main Studio opened the matching catalog, rescanned, validated with zero errors, and exported the final runtime pack.</w:t>
+        <w:t>If an optional Main Studio correction was made, the matching catalog was saved, validated with zero errors, exported, and followed by a component-kit refresh.</w:t>
       </w:r>
     </w:p>
     <w:p>
@@ -6361,7 +6414,7 @@
         <w:t xml:space="preserve">[  ] </w:t>
       </w:r>
       <w:r>
-        <w:t>Component kit was regenerated after the final export.</w:t>
+        <w:t>If no optional Studio correction was needed, the single-pass Wizard's final runtime pack and refreshed component kit were used unchanged.</w:t>
       </w:r>
     </w:p>
     <w:p>

</xml_diff>

<commit_message>
Improve runtime translation and layout review
</commit_message>
<xml_diff>
--- a/docs/guides/Delphi App Translation Studio Wizard-to-Runtime Complete Procedure.docx
+++ b/docs/guides/Delphi App Translation Studio Wizard-to-Runtime Complete Procedure.docx
@@ -3755,7 +3755,7 @@
         </w:numPr>
       </w:pPr>
       <w:r>
-        <w:t>Click Generate Review Package, then Open Visual Review. Review the estimated translated forms in the browser. This preview is advisory; it does not alter a Delphi form.</w:t>
+        <w:t>Click Open Visual Review. The review package is generated automatically when the Review Center opens and is refreshed whenever a layout decision is saved. The browser shows the current translated geometry beside the proposed geometry; proposed changes are outlined in green. This preview does not alter a Delphi form.</w:t>
       </w:r>
     </w:p>
     <w:p>
@@ -3827,7 +3827,7 @@
         </w:numPr>
       </w:pPr>
       <w:r>
-        <w:t>Open Layout Proposals. Select a proposal and read its form, control, property, current value, proposed value, reason, decision, and What happens explanation.</w:t>
+        <w:t>Open Layout Proposals. Select a proposal and read its form, control, property, current value, proposed value, reason, decision, and What happens explanation. Use Open Visual Review before accepting a group so the proposed result can be judged as a screen, not merely as numbers.</w:t>
       </w:r>
     </w:p>
     <w:p>
@@ -4091,7 +4091,19 @@
         </w:numPr>
       </w:pPr>
       <w:r>
-        <w:t>Click the blue component-kit path or Open Kit Folder. Confirm ComponentSource, Localization, component-integration.json, Deploy-LanguagePacks.ps1, README.txt, and Wizard-Completion-Report.txt exist.</w:t>
+        <w:t>Click the underlined blue component-kit path or Open Kit Folder. Confirm ComponentSource, Localization, component-integration.json, Deploy-LanguagePacks.ps1, README.txt, and Wizard-Completion-Report.txt exist.</w:t>
+      </w:r>
+    </w:p>
+    <w:p>
+      <w:pPr>
+        <w:pStyle w:val="ListNumber"/>
+        <w:numPr>
+          <w:ilvl w:val="0"/>
+          <w:numId w:val="23"/>
+        </w:numPr>
+      </w:pPr>
+      <w:r>
+        <w:t>Read the explanation above Fallback Commands. No command must be copied during a normal successful run. Deploy Build Outputs executes the commands for build-output folders that already exist; the displayed commands are a troubleshooting fallback only.</w:t>
       </w:r>
     </w:p>
     <w:p>
@@ -5616,6 +5628,34 @@
       </w:r>
       <w:r>
         <w:t>Accepted WordWrap or AutoSize rules apply only to the identified control and language.</w:t>
+      </w:r>
+    </w:p>
+    <w:p>
+      <w:pPr>
+        <w:ind w:left="216" w:hanging="216"/>
+      </w:pPr>
+      <w:r>
+        <w:rPr>
+          <w:b/>
+        </w:rPr>
+        <w:t xml:space="preserve">[  ] </w:t>
+      </w:r>
+      <w:r>
+        <w:t>Long label and check-box text may use WordWrap with a calculated Height instead of uncontrolled horizontal growth.</w:t>
+      </w:r>
+    </w:p>
+    <w:p>
+      <w:pPr>
+        <w:ind w:left="216" w:hanging="216"/>
+      </w:pPr>
+      <w:r>
+        <w:rPr>
+          <w:b/>
+        </w:rPr>
+        <w:t xml:space="preserve">[  ] </w:t>
+      </w:r>
+      <w:r>
+        <w:t>Grid column proposals enlarge translated headings conservatively without resizing the entire grid beyond its parent.</w:t>
       </w:r>
     </w:p>
     <w:p>

</xml_diff>